<commit_message>
readme and document updated
</commit_message>
<xml_diff>
--- a/Documentations/Detail_Design_Guide_1_Creating_VIVADO_Design_and_SDT.docx
+++ b/Documentations/Detail_Design_Guide_1_Creating_VIVADO_Design_and_SDT.docx
@@ -10,28 +10,12 @@
           <w:color w:val="000000" w:themeColor="text1"/>
         </w:rPr>
       </w:pPr>
-      <w:proofErr w:type="spellStart"/>
       <w:r>
         <w:rPr>
           <w:color w:val="000000" w:themeColor="text1"/>
         </w:rPr>
-        <w:t>MicroBlaze</w:t>
+        <w:t>MicroBlaze-V-Zephyr-Kria-OpenAMP</w:t>
       </w:r>
-      <w:proofErr w:type="spellEnd"/>
-      <w:r>
-        <w:rPr>
-          <w:color w:val="000000" w:themeColor="text1"/>
-        </w:rPr>
-        <w:t>-V-Zephyr-Kria-</w:t>
-      </w:r>
-      <w:proofErr w:type="spellStart"/>
-      <w:r>
-        <w:rPr>
-          <w:color w:val="000000" w:themeColor="text1"/>
-        </w:rPr>
-        <w:t>OpenAMP</w:t>
-      </w:r>
-      <w:proofErr w:type="spellEnd"/>
     </w:p>
     <w:p>
       <w:pPr>
@@ -66,13 +50,286 @@
       </w:r>
     </w:p>
     <w:p/>
-    <w:p/>
-    <w:p/>
     <w:p>
       <w:pPr>
+        <w:pStyle w:val="ListParagraph"/>
+        <w:numPr>
+          <w:ilvl w:val="0"/>
+          <w:numId w:val="4"/>
+        </w:numPr>
+      </w:pPr>
+      <w:r>
+        <w:t>VIVADO Block design</w:t>
+      </w:r>
+    </w:p>
+    <w:p>
+      <w:r>
+        <w:rPr>
+          <w:noProof/>
+        </w:rPr>
+        <w:drawing>
+          <wp:inline distT="0" distB="0" distL="0" distR="0" wp14:anchorId="15973041" wp14:editId="0791F2D0">
+            <wp:extent cx="5943600" cy="3067050"/>
+            <wp:effectExtent l="0" t="0" r="0" b="0"/>
+            <wp:docPr id="1885528736" name="Picture 3"/>
+            <wp:cNvGraphicFramePr>
+              <a:graphicFrameLocks xmlns:a="http://schemas.openxmlformats.org/drawingml/2006/main" noChangeAspect="1"/>
+            </wp:cNvGraphicFramePr>
+            <a:graphic xmlns:a="http://schemas.openxmlformats.org/drawingml/2006/main">
+              <a:graphicData uri="http://schemas.openxmlformats.org/drawingml/2006/picture">
+                <pic:pic xmlns:pic="http://schemas.openxmlformats.org/drawingml/2006/picture">
+                  <pic:nvPicPr>
+                    <pic:cNvPr id="0" name="Picture 1"/>
+                    <pic:cNvPicPr>
+                      <a:picLocks noChangeAspect="1" noChangeArrowheads="1"/>
+                    </pic:cNvPicPr>
+                  </pic:nvPicPr>
+                  <pic:blipFill>
+                    <a:blip r:embed="rId7" cstate="print">
+                      <a:extLst>
+                        <a:ext uri="{28A0092B-C50C-407E-A947-70E740481C1C}">
+                          <a14:useLocalDpi xmlns:a14="http://schemas.microsoft.com/office/drawing/2010/main" val="0"/>
+                        </a:ext>
+                      </a:extLst>
+                    </a:blip>
+                    <a:srcRect/>
+                    <a:stretch>
+                      <a:fillRect/>
+                    </a:stretch>
+                  </pic:blipFill>
+                  <pic:spPr bwMode="auto">
+                    <a:xfrm>
+                      <a:off x="0" y="0"/>
+                      <a:ext cx="5943600" cy="3067050"/>
+                    </a:xfrm>
+                    <a:prstGeom prst="rect">
+                      <a:avLst/>
+                    </a:prstGeom>
+                    <a:noFill/>
+                    <a:ln>
+                      <a:noFill/>
+                    </a:ln>
+                  </pic:spPr>
+                </pic:pic>
+              </a:graphicData>
+            </a:graphic>
+          </wp:inline>
+        </w:drawing>
+      </w:r>
+    </w:p>
+    <w:p>
+      <w:pPr>
+        <w:pStyle w:val="ListParagraph"/>
+        <w:numPr>
+          <w:ilvl w:val="0"/>
+          <w:numId w:val="4"/>
+        </w:numPr>
+      </w:pPr>
+      <w:r>
+        <w:t>VIVADO Address Editor</w:t>
+      </w:r>
+    </w:p>
+    <w:p>
+      <w:pPr>
+        <w:pStyle w:val="ListParagraph"/>
+      </w:pPr>
+      <w:r>
+        <w:lastRenderedPageBreak/>
+        <w:drawing>
+          <wp:inline distT="0" distB="0" distL="0" distR="0" wp14:anchorId="2F557600" wp14:editId="7A560AD1">
+            <wp:extent cx="5943600" cy="4847590"/>
+            <wp:effectExtent l="0" t="0" r="0" b="0"/>
+            <wp:docPr id="1471423848" name="Picture 1"/>
+            <wp:cNvGraphicFramePr>
+              <a:graphicFrameLocks xmlns:a="http://schemas.openxmlformats.org/drawingml/2006/main" noChangeAspect="1"/>
+            </wp:cNvGraphicFramePr>
+            <a:graphic xmlns:a="http://schemas.openxmlformats.org/drawingml/2006/main">
+              <a:graphicData uri="http://schemas.openxmlformats.org/drawingml/2006/picture">
+                <pic:pic xmlns:pic="http://schemas.openxmlformats.org/drawingml/2006/picture">
+                  <pic:nvPicPr>
+                    <pic:cNvPr id="1471423848" name=""/>
+                    <pic:cNvPicPr/>
+                  </pic:nvPicPr>
+                  <pic:blipFill>
+                    <a:blip r:embed="rId8"/>
+                    <a:stretch>
+                      <a:fillRect/>
+                    </a:stretch>
+                  </pic:blipFill>
+                  <pic:spPr>
+                    <a:xfrm>
+                      <a:off x="0" y="0"/>
+                      <a:ext cx="5943600" cy="4847590"/>
+                    </a:xfrm>
+                    <a:prstGeom prst="rect">
+                      <a:avLst/>
+                    </a:prstGeom>
+                  </pic:spPr>
+                </pic:pic>
+              </a:graphicData>
+            </a:graphic>
+          </wp:inline>
+        </w:drawing>
+      </w:r>
+    </w:p>
+    <w:p>
+      <w:pPr>
+        <w:pStyle w:val="ListParagraph"/>
+      </w:pPr>
+    </w:p>
+    <w:p>
+      <w:pPr>
+        <w:pStyle w:val="ListParagraph"/>
+        <w:numPr>
+          <w:ilvl w:val="0"/>
+          <w:numId w:val="4"/>
+        </w:numPr>
+      </w:pPr>
+      <w:r>
+        <w:t>Constraint</w:t>
+      </w:r>
+    </w:p>
+    <w:p>
+      <w:pPr>
+        <w:ind w:left="720"/>
+      </w:pPr>
+      <w:r>
+        <w:lastRenderedPageBreak/>
+        <w:drawing>
+          <wp:inline distT="0" distB="0" distL="0" distR="0" wp14:anchorId="44183B84" wp14:editId="63AA3E86">
+            <wp:extent cx="3723347" cy="3479800"/>
+            <wp:effectExtent l="19050" t="19050" r="10795" b="25400"/>
+            <wp:docPr id="228319959" name="Picture 1"/>
+            <wp:cNvGraphicFramePr>
+              <a:graphicFrameLocks xmlns:a="http://schemas.openxmlformats.org/drawingml/2006/main" noChangeAspect="1"/>
+            </wp:cNvGraphicFramePr>
+            <a:graphic xmlns:a="http://schemas.openxmlformats.org/drawingml/2006/main">
+              <a:graphicData uri="http://schemas.openxmlformats.org/drawingml/2006/picture">
+                <pic:pic xmlns:pic="http://schemas.openxmlformats.org/drawingml/2006/picture">
+                  <pic:nvPicPr>
+                    <pic:cNvPr id="228319959" name=""/>
+                    <pic:cNvPicPr/>
+                  </pic:nvPicPr>
+                  <pic:blipFill rotWithShape="1">
+                    <a:blip r:embed="rId9"/>
+                    <a:srcRect l="1121"/>
+                    <a:stretch>
+                      <a:fillRect/>
+                    </a:stretch>
+                  </pic:blipFill>
+                  <pic:spPr bwMode="auto">
+                    <a:xfrm>
+                      <a:off x="0" y="0"/>
+                      <a:ext cx="3723539" cy="3479979"/>
+                    </a:xfrm>
+                    <a:prstGeom prst="rect">
+                      <a:avLst/>
+                    </a:prstGeom>
+                    <a:ln>
+                      <a:solidFill>
+                        <a:schemeClr val="bg1">
+                          <a:lumMod val="65000"/>
+                        </a:schemeClr>
+                      </a:solidFill>
+                    </a:ln>
+                    <a:extLst>
+                      <a:ext uri="{53640926-AAD7-44D8-BBD7-CCE9431645EC}">
+                        <a14:shadowObscured xmlns:a14="http://schemas.microsoft.com/office/drawing/2010/main"/>
+                      </a:ext>
+                    </a:extLst>
+                  </pic:spPr>
+                </pic:pic>
+              </a:graphicData>
+            </a:graphic>
+          </wp:inline>
+        </w:drawing>
+      </w:r>
+      <w:r>
+        <w:drawing>
+          <wp:inline distT="0" distB="0" distL="0" distR="0" wp14:anchorId="41DE23FA" wp14:editId="17E54BD8">
+            <wp:extent cx="3737024" cy="3333750"/>
+            <wp:effectExtent l="19050" t="19050" r="15875" b="19050"/>
+            <wp:docPr id="86694653" name="Picture 1"/>
+            <wp:cNvGraphicFramePr>
+              <a:graphicFrameLocks xmlns:a="http://schemas.openxmlformats.org/drawingml/2006/main" noChangeAspect="1"/>
+            </wp:cNvGraphicFramePr>
+            <a:graphic xmlns:a="http://schemas.openxmlformats.org/drawingml/2006/main">
+              <a:graphicData uri="http://schemas.openxmlformats.org/drawingml/2006/picture">
+                <pic:pic xmlns:pic="http://schemas.openxmlformats.org/drawingml/2006/picture">
+                  <pic:nvPicPr>
+                    <pic:cNvPr id="86694653" name=""/>
+                    <pic:cNvPicPr/>
+                  </pic:nvPicPr>
+                  <pic:blipFill rotWithShape="1">
+                    <a:blip r:embed="rId10"/>
+                    <a:srcRect r="15927"/>
+                    <a:stretch>
+                      <a:fillRect/>
+                    </a:stretch>
+                  </pic:blipFill>
+                  <pic:spPr bwMode="auto">
+                    <a:xfrm>
+                      <a:off x="0" y="0"/>
+                      <a:ext cx="3737216" cy="3333921"/>
+                    </a:xfrm>
+                    <a:prstGeom prst="rect">
+                      <a:avLst/>
+                    </a:prstGeom>
+                    <a:ln w="9525" cap="flat" cmpd="sng" algn="ctr">
+                      <a:solidFill>
+                        <a:sysClr val="window" lastClr="FFFFFF">
+                          <a:lumMod val="65000"/>
+                        </a:sysClr>
+                      </a:solidFill>
+                      <a:prstDash val="solid"/>
+                      <a:round/>
+                      <a:headEnd type="none" w="med" len="med"/>
+                      <a:tailEnd type="none" w="med" len="med"/>
+                      <a:extLst>
+                        <a:ext uri="{C807C97D-BFC1-408E-A445-0C87EB9F89A2}">
+                          <ask:lineSketchStyleProps xmlns:ask="http://schemas.microsoft.com/office/drawing/2018/sketchyshapes" sd="0">
+                            <a:custGeom>
+                              <a:avLst/>
+                              <a:gdLst/>
+                              <a:ahLst/>
+                              <a:cxnLst/>
+                              <a:rect l="0" t="0" r="0" b="0"/>
+                              <a:pathLst/>
+                            </a:custGeom>
+                            <ask:type/>
+                          </ask:lineSketchStyleProps>
+                        </a:ext>
+                      </a:extLst>
+                    </a:ln>
+                    <a:extLst>
+                      <a:ext uri="{53640926-AAD7-44D8-BBD7-CCE9431645EC}">
+                        <a14:shadowObscured xmlns:a14="http://schemas.microsoft.com/office/drawing/2010/main"/>
+                      </a:ext>
+                    </a:extLst>
+                  </pic:spPr>
+                </pic:pic>
+              </a:graphicData>
+            </a:graphic>
+          </wp:inline>
+        </w:drawing>
+      </w:r>
+    </w:p>
+    <w:p>
+      <w:pPr>
+        <w:ind w:left="720"/>
+      </w:pPr>
+    </w:p>
+    <w:p>
+      <w:pPr>
+        <w:ind w:left="720"/>
+      </w:pPr>
+    </w:p>
+    <w:p>
+      <w:pPr>
         <w:pStyle w:val="Heading2"/>
       </w:pPr>
       <w:r>
+        <w:lastRenderedPageBreak/>
         <w:t>Creating the SDT- device tree</w:t>
       </w:r>
     </w:p>
@@ -99,143 +356,71 @@
           <w:sz w:val="22"/>
           <w:szCs w:val="22"/>
         </w:rPr>
-        <w:t xml:space="preserve">eval </w:t>
+        <w:t>eval sdtgen set_dt_param -dir zephyr -xsa zephyr_wrapper.xsa ; sdtgen generate_sdt</w:t>
       </w:r>
-      <w:proofErr w:type="spellStart"/>
-      <w:r>
-        <w:rPr>
-          <w:rFonts w:ascii="Courier New" w:hAnsi="Courier New" w:cs="Courier New"/>
-          <w:sz w:val="22"/>
-          <w:szCs w:val="22"/>
-        </w:rPr>
-        <w:t>sdtgen</w:t>
-      </w:r>
-      <w:proofErr w:type="spellEnd"/>
-      <w:r>
-        <w:rPr>
-          <w:rFonts w:ascii="Courier New" w:hAnsi="Courier New" w:cs="Courier New"/>
-          <w:sz w:val="22"/>
-          <w:szCs w:val="22"/>
-        </w:rPr>
-        <w:t xml:space="preserve"> </w:t>
-      </w:r>
-      <w:proofErr w:type="spellStart"/>
-      <w:r>
-        <w:rPr>
-          <w:rFonts w:ascii="Courier New" w:hAnsi="Courier New" w:cs="Courier New"/>
-          <w:sz w:val="22"/>
-          <w:szCs w:val="22"/>
-        </w:rPr>
-        <w:t>set_dt_param</w:t>
-      </w:r>
-      <w:proofErr w:type="spellEnd"/>
-      <w:r>
-        <w:rPr>
-          <w:rFonts w:ascii="Courier New" w:hAnsi="Courier New" w:cs="Courier New"/>
-          <w:sz w:val="22"/>
-          <w:szCs w:val="22"/>
-        </w:rPr>
-        <w:t xml:space="preserve"> -</w:t>
-      </w:r>
-      <w:proofErr w:type="spellStart"/>
-      <w:r>
-        <w:rPr>
-          <w:rFonts w:ascii="Courier New" w:hAnsi="Courier New" w:cs="Courier New"/>
-          <w:sz w:val="22"/>
-          <w:szCs w:val="22"/>
-        </w:rPr>
-        <w:t>dir</w:t>
-      </w:r>
-      <w:proofErr w:type="spellEnd"/>
-      <w:r>
-        <w:rPr>
-          <w:rFonts w:ascii="Courier New" w:hAnsi="Courier New" w:cs="Courier New"/>
-          <w:sz w:val="22"/>
-          <w:szCs w:val="22"/>
-        </w:rPr>
-        <w:t xml:space="preserve"> zephyr -</w:t>
-      </w:r>
-      <w:proofErr w:type="spellStart"/>
-      <w:r>
-        <w:rPr>
-          <w:rFonts w:ascii="Courier New" w:hAnsi="Courier New" w:cs="Courier New"/>
-          <w:sz w:val="22"/>
-          <w:szCs w:val="22"/>
-        </w:rPr>
-        <w:t>xsa</w:t>
-      </w:r>
-      <w:proofErr w:type="spellEnd"/>
-      <w:r>
-        <w:rPr>
-          <w:rFonts w:ascii="Courier New" w:hAnsi="Courier New" w:cs="Courier New"/>
-          <w:sz w:val="22"/>
-          <w:szCs w:val="22"/>
-        </w:rPr>
-        <w:t xml:space="preserve"> </w:t>
-      </w:r>
-      <w:proofErr w:type="spellStart"/>
-      <w:proofErr w:type="gramStart"/>
-      <w:r>
-        <w:rPr>
-          <w:rFonts w:ascii="Courier New" w:hAnsi="Courier New" w:cs="Courier New"/>
-          <w:sz w:val="22"/>
-          <w:szCs w:val="22"/>
-        </w:rPr>
-        <w:t>zephyr_wrapper.xsa</w:t>
-      </w:r>
-      <w:proofErr w:type="spellEnd"/>
-      <w:r>
-        <w:rPr>
-          <w:rFonts w:ascii="Courier New" w:hAnsi="Courier New" w:cs="Courier New"/>
-          <w:sz w:val="22"/>
-          <w:szCs w:val="22"/>
-        </w:rPr>
-        <w:t xml:space="preserve"> ;</w:t>
-      </w:r>
-      <w:proofErr w:type="gramEnd"/>
-      <w:r>
-        <w:rPr>
-          <w:rFonts w:ascii="Courier New" w:hAnsi="Courier New" w:cs="Courier New"/>
-          <w:sz w:val="22"/>
-          <w:szCs w:val="22"/>
-        </w:rPr>
-        <w:t xml:space="preserve"> </w:t>
-      </w:r>
-      <w:proofErr w:type="spellStart"/>
-      <w:r>
-        <w:rPr>
-          <w:rFonts w:ascii="Courier New" w:hAnsi="Courier New" w:cs="Courier New"/>
-          <w:sz w:val="22"/>
-          <w:szCs w:val="22"/>
-        </w:rPr>
-        <w:t>sdtgen</w:t>
-      </w:r>
-      <w:proofErr w:type="spellEnd"/>
-      <w:r>
-        <w:rPr>
-          <w:rFonts w:ascii="Courier New" w:hAnsi="Courier New" w:cs="Courier New"/>
-          <w:sz w:val="22"/>
-          <w:szCs w:val="22"/>
-        </w:rPr>
-        <w:t xml:space="preserve"> </w:t>
-      </w:r>
-      <w:proofErr w:type="spellStart"/>
-      <w:r>
-        <w:rPr>
-          <w:rFonts w:ascii="Courier New" w:hAnsi="Courier New" w:cs="Courier New"/>
-          <w:sz w:val="22"/>
-          <w:szCs w:val="22"/>
-        </w:rPr>
-        <w:t>generate_sdt</w:t>
-      </w:r>
-      <w:proofErr w:type="spellEnd"/>
     </w:p>
     <w:p>
       <w:pPr>
         <w:pStyle w:val="ListParagraph"/>
       </w:pPr>
     </w:p>
-    <w:p/>
+    <w:p>
+      <w:pPr>
+        <w:pStyle w:val="ListParagraph"/>
+      </w:pPr>
+      <w:r>
+        <w:t>Below is the command run and generated device tree files from SDT Generator.</w:t>
+      </w:r>
+    </w:p>
+    <w:p>
+      <w:pPr>
+        <w:jc w:val="center"/>
+      </w:pPr>
+      <w:r>
+        <w:drawing>
+          <wp:inline distT="0" distB="0" distL="0" distR="0" wp14:anchorId="4962DC54" wp14:editId="13CC416C">
+            <wp:extent cx="5943600" cy="2315845"/>
+            <wp:effectExtent l="19050" t="19050" r="19050" b="27305"/>
+            <wp:docPr id="1607957731" name="Picture 1"/>
+            <wp:cNvGraphicFramePr>
+              <a:graphicFrameLocks xmlns:a="http://schemas.openxmlformats.org/drawingml/2006/main" noChangeAspect="1"/>
+            </wp:cNvGraphicFramePr>
+            <a:graphic xmlns:a="http://schemas.openxmlformats.org/drawingml/2006/main">
+              <a:graphicData uri="http://schemas.openxmlformats.org/drawingml/2006/picture">
+                <pic:pic xmlns:pic="http://schemas.openxmlformats.org/drawingml/2006/picture">
+                  <pic:nvPicPr>
+                    <pic:cNvPr id="1607957731" name=""/>
+                    <pic:cNvPicPr/>
+                  </pic:nvPicPr>
+                  <pic:blipFill>
+                    <a:blip r:embed="rId11"/>
+                    <a:stretch>
+                      <a:fillRect/>
+                    </a:stretch>
+                  </pic:blipFill>
+                  <pic:spPr>
+                    <a:xfrm>
+                      <a:off x="0" y="0"/>
+                      <a:ext cx="5943600" cy="2315845"/>
+                    </a:xfrm>
+                    <a:prstGeom prst="rect">
+                      <a:avLst/>
+                    </a:prstGeom>
+                    <a:ln>
+                      <a:solidFill>
+                        <a:schemeClr val="bg1">
+                          <a:lumMod val="65000"/>
+                        </a:schemeClr>
+                      </a:solidFill>
+                    </a:ln>
+                  </pic:spPr>
+                </pic:pic>
+              </a:graphicData>
+            </a:graphic>
+          </wp:inline>
+        </w:drawing>
+      </w:r>
+    </w:p>
     <w:p>
       <w:r>
         <w:br w:type="page"/>
@@ -274,11 +459,9 @@
             <w:tcW w:w="587" w:type="dxa"/>
           </w:tcPr>
           <w:p>
-            <w:proofErr w:type="gramStart"/>
             <w:r>
               <w:t>S.N</w:t>
             </w:r>
-            <w:proofErr w:type="gramEnd"/>
           </w:p>
         </w:tc>
         <w:tc>
@@ -358,8 +541,8 @@
     <w:p/>
     <w:p/>
     <w:sectPr>
-      <w:headerReference w:type="default" r:id="rId7"/>
-      <w:footerReference w:type="default" r:id="rId8"/>
+      <w:headerReference w:type="default" r:id="rId12"/>
+      <w:footerReference w:type="default" r:id="rId13"/>
       <w:pgSz w:w="12240" w:h="15840"/>
       <w:pgMar w:top="1440" w:right="1440" w:bottom="1440" w:left="1440" w:header="720" w:footer="720" w:gutter="0"/>
       <w:cols w:space="720"/>
@@ -1046,6 +1229,95 @@
       </w:pPr>
     </w:lvl>
   </w:abstractNum>
+  <w:abstractNum w:abstractNumId="3" w15:restartNumberingAfterBreak="0">
+    <w:nsid w:val="468A6054"/>
+    <w:multiLevelType w:val="hybridMultilevel"/>
+    <w:tmpl w:val="C5CCBF7E"/>
+    <w:lvl w:ilvl="0" w:tplc="0409000F">
+      <w:start w:val="1"/>
+      <w:numFmt w:val="decimal"/>
+      <w:lvlText w:val="%1."/>
+      <w:lvlJc w:val="left"/>
+      <w:pPr>
+        <w:ind w:left="720" w:hanging="360"/>
+      </w:pPr>
+      <w:rPr>
+        <w:rFonts w:hint="default"/>
+      </w:rPr>
+    </w:lvl>
+    <w:lvl w:ilvl="1" w:tplc="04090019" w:tentative="1">
+      <w:start w:val="1"/>
+      <w:numFmt w:val="lowerLetter"/>
+      <w:lvlText w:val="%2."/>
+      <w:lvlJc w:val="left"/>
+      <w:pPr>
+        <w:ind w:left="1440" w:hanging="360"/>
+      </w:pPr>
+    </w:lvl>
+    <w:lvl w:ilvl="2" w:tplc="0409001B" w:tentative="1">
+      <w:start w:val="1"/>
+      <w:numFmt w:val="lowerRoman"/>
+      <w:lvlText w:val="%3."/>
+      <w:lvlJc w:val="right"/>
+      <w:pPr>
+        <w:ind w:left="2160" w:hanging="180"/>
+      </w:pPr>
+    </w:lvl>
+    <w:lvl w:ilvl="3" w:tplc="0409000F" w:tentative="1">
+      <w:start w:val="1"/>
+      <w:numFmt w:val="decimal"/>
+      <w:lvlText w:val="%4."/>
+      <w:lvlJc w:val="left"/>
+      <w:pPr>
+        <w:ind w:left="2880" w:hanging="360"/>
+      </w:pPr>
+    </w:lvl>
+    <w:lvl w:ilvl="4" w:tplc="04090019" w:tentative="1">
+      <w:start w:val="1"/>
+      <w:numFmt w:val="lowerLetter"/>
+      <w:lvlText w:val="%5."/>
+      <w:lvlJc w:val="left"/>
+      <w:pPr>
+        <w:ind w:left="3600" w:hanging="360"/>
+      </w:pPr>
+    </w:lvl>
+    <w:lvl w:ilvl="5" w:tplc="0409001B" w:tentative="1">
+      <w:start w:val="1"/>
+      <w:numFmt w:val="lowerRoman"/>
+      <w:lvlText w:val="%6."/>
+      <w:lvlJc w:val="right"/>
+      <w:pPr>
+        <w:ind w:left="4320" w:hanging="180"/>
+      </w:pPr>
+    </w:lvl>
+    <w:lvl w:ilvl="6" w:tplc="0409000F" w:tentative="1">
+      <w:start w:val="1"/>
+      <w:numFmt w:val="decimal"/>
+      <w:lvlText w:val="%7."/>
+      <w:lvlJc w:val="left"/>
+      <w:pPr>
+        <w:ind w:left="5040" w:hanging="360"/>
+      </w:pPr>
+    </w:lvl>
+    <w:lvl w:ilvl="7" w:tplc="04090019" w:tentative="1">
+      <w:start w:val="1"/>
+      <w:numFmt w:val="lowerLetter"/>
+      <w:lvlText w:val="%8."/>
+      <w:lvlJc w:val="left"/>
+      <w:pPr>
+        <w:ind w:left="5760" w:hanging="360"/>
+      </w:pPr>
+    </w:lvl>
+    <w:lvl w:ilvl="8" w:tplc="0409001B" w:tentative="1">
+      <w:start w:val="1"/>
+      <w:numFmt w:val="lowerRoman"/>
+      <w:lvlText w:val="%9."/>
+      <w:lvlJc w:val="right"/>
+      <w:pPr>
+        <w:ind w:left="6480" w:hanging="180"/>
+      </w:pPr>
+    </w:lvl>
+  </w:abstractNum>
   <w:num w:numId="1" w16cid:durableId="723676719">
     <w:abstractNumId w:val="0"/>
   </w:num>
@@ -1054,6 +1326,9 @@
   </w:num>
   <w:num w:numId="3" w16cid:durableId="575165877">
     <w:abstractNumId w:val="2"/>
+  </w:num>
+  <w:num w:numId="4" w16cid:durableId="1215040968">
+    <w:abstractNumId w:val="3"/>
   </w:num>
 </w:numbering>
 </file>
@@ -1664,6 +1939,7 @@
   <w:style w:type="character" w:default="1" w:styleId="DefaultParagraphFont">
     <w:name w:val="Default Paragraph Font"/>
     <w:uiPriority w:val="1"/>
+    <w:semiHidden/>
     <w:unhideWhenUsed/>
   </w:style>
   <w:style w:type="table" w:default="1" w:styleId="TableNormal">

</xml_diff>

<commit_message>
VIVADO hardware files and readme updted
</commit_message>
<xml_diff>
--- a/Documentations/Detail_Design_Guide_1_Creating_VIVADO_Design_and_SDT.docx
+++ b/Documentations/Detail_Design_Guide_1_Creating_VIVADO_Design_and_SDT.docx
@@ -10,12 +10,28 @@
           <w:color w:val="000000" w:themeColor="text1"/>
         </w:rPr>
       </w:pPr>
+      <w:proofErr w:type="spellStart"/>
       <w:r>
         <w:rPr>
           <w:color w:val="000000" w:themeColor="text1"/>
         </w:rPr>
-        <w:t>MicroBlaze-V-Zephyr-Kria-OpenAMP</w:t>
-      </w:r>
+        <w:t>MicroBlaze</w:t>
+      </w:r>
+      <w:proofErr w:type="spellEnd"/>
+      <w:r>
+        <w:rPr>
+          <w:color w:val="000000" w:themeColor="text1"/>
+        </w:rPr>
+        <w:t>-V-Zephyr-Kria-</w:t>
+      </w:r>
+      <w:proofErr w:type="spellStart"/>
+      <w:r>
+        <w:rPr>
+          <w:color w:val="000000" w:themeColor="text1"/>
+        </w:rPr>
+        <w:t>OpenAMP</w:t>
+      </w:r>
+      <w:proofErr w:type="spellEnd"/>
     </w:p>
     <w:p>
       <w:pPr>
@@ -68,7 +84,7 @@
           <w:noProof/>
         </w:rPr>
         <w:drawing>
-          <wp:inline distT="0" distB="0" distL="0" distR="0" wp14:anchorId="15973041" wp14:editId="0791F2D0">
+          <wp:inline distT="0" distB="0" distL="0" distR="0" wp14:anchorId="15973041" wp14:editId="4A058CFF">
             <wp:extent cx="5943600" cy="3067050"/>
             <wp:effectExtent l="0" t="0" r="0" b="0"/>
             <wp:docPr id="1885528736" name="Picture 3"/>
@@ -126,6 +142,180 @@
         </w:numPr>
       </w:pPr>
       <w:r>
+        <w:t xml:space="preserve">Microblaze IP </w:t>
+      </w:r>
+      <w:r>
+        <w:t>Block Automation option</w:t>
+      </w:r>
+    </w:p>
+    <w:p>
+      <w:pPr>
+        <w:pStyle w:val="ListParagraph"/>
+      </w:pPr>
+      <w:r>
+        <w:lastRenderedPageBreak/>
+        <w:drawing>
+          <wp:inline distT="0" distB="0" distL="0" distR="0" wp14:anchorId="4FE57252" wp14:editId="5F925F0D">
+            <wp:extent cx="4290646" cy="2829718"/>
+            <wp:effectExtent l="0" t="0" r="0" b="8890"/>
+            <wp:docPr id="626443861" name="Picture 1"/>
+            <wp:cNvGraphicFramePr>
+              <a:graphicFrameLocks xmlns:a="http://schemas.openxmlformats.org/drawingml/2006/main" noChangeAspect="1"/>
+            </wp:cNvGraphicFramePr>
+            <a:graphic xmlns:a="http://schemas.openxmlformats.org/drawingml/2006/main">
+              <a:graphicData uri="http://schemas.openxmlformats.org/drawingml/2006/picture">
+                <pic:pic xmlns:pic="http://schemas.openxmlformats.org/drawingml/2006/picture">
+                  <pic:nvPicPr>
+                    <pic:cNvPr id="626443861" name=""/>
+                    <pic:cNvPicPr/>
+                  </pic:nvPicPr>
+                  <pic:blipFill>
+                    <a:blip r:embed="rId8"/>
+                    <a:stretch>
+                      <a:fillRect/>
+                    </a:stretch>
+                  </pic:blipFill>
+                  <pic:spPr>
+                    <a:xfrm>
+                      <a:off x="0" y="0"/>
+                      <a:ext cx="4293874" cy="2831847"/>
+                    </a:xfrm>
+                    <a:prstGeom prst="rect">
+                      <a:avLst/>
+                    </a:prstGeom>
+                  </pic:spPr>
+                </pic:pic>
+              </a:graphicData>
+            </a:graphic>
+          </wp:inline>
+        </w:drawing>
+      </w:r>
+    </w:p>
+    <w:p>
+      <w:pPr>
+        <w:pStyle w:val="ListParagraph"/>
+      </w:pPr>
+    </w:p>
+    <w:p>
+      <w:pPr>
+        <w:pStyle w:val="ListParagraph"/>
+      </w:pPr>
+      <w:r>
+        <w:t>Microblaze IP Config:</w:t>
+      </w:r>
+    </w:p>
+    <w:p>
+      <w:pPr>
+        <w:pStyle w:val="ListParagraph"/>
+      </w:pPr>
+      <w:r>
+        <w:drawing>
+          <wp:inline distT="0" distB="0" distL="0" distR="0" wp14:anchorId="29377C81" wp14:editId="1733EE40">
+            <wp:extent cx="4121834" cy="2933284"/>
+            <wp:effectExtent l="0" t="0" r="0" b="635"/>
+            <wp:docPr id="1301925738" name="Picture 1"/>
+            <wp:cNvGraphicFramePr>
+              <a:graphicFrameLocks xmlns:a="http://schemas.openxmlformats.org/drawingml/2006/main" noChangeAspect="1"/>
+            </wp:cNvGraphicFramePr>
+            <a:graphic xmlns:a="http://schemas.openxmlformats.org/drawingml/2006/main">
+              <a:graphicData uri="http://schemas.openxmlformats.org/drawingml/2006/picture">
+                <pic:pic xmlns:pic="http://schemas.openxmlformats.org/drawingml/2006/picture">
+                  <pic:nvPicPr>
+                    <pic:cNvPr id="1301925738" name=""/>
+                    <pic:cNvPicPr/>
+                  </pic:nvPicPr>
+                  <pic:blipFill>
+                    <a:blip r:embed="rId9"/>
+                    <a:stretch>
+                      <a:fillRect/>
+                    </a:stretch>
+                  </pic:blipFill>
+                  <pic:spPr>
+                    <a:xfrm>
+                      <a:off x="0" y="0"/>
+                      <a:ext cx="4124702" cy="2935325"/>
+                    </a:xfrm>
+                    <a:prstGeom prst="rect">
+                      <a:avLst/>
+                    </a:prstGeom>
+                  </pic:spPr>
+                </pic:pic>
+              </a:graphicData>
+            </a:graphic>
+          </wp:inline>
+        </w:drawing>
+      </w:r>
+    </w:p>
+    <w:p>
+      <w:pPr>
+        <w:pStyle w:val="ListParagraph"/>
+      </w:pPr>
+    </w:p>
+    <w:p>
+      <w:pPr>
+        <w:pStyle w:val="ListParagraph"/>
+      </w:pPr>
+      <w:r>
+        <w:t>Microblaze V minimal block design with local memory and AXI interface ports enabled:</w:t>
+      </w:r>
+    </w:p>
+    <w:p>
+      <w:pPr>
+        <w:pStyle w:val="ListParagraph"/>
+      </w:pPr>
+      <w:r>
+        <w:lastRenderedPageBreak/>
+        <w:drawing>
+          <wp:inline distT="0" distB="0" distL="0" distR="0" wp14:anchorId="3AF8897D" wp14:editId="3ED946E3">
+            <wp:extent cx="5943600" cy="3006090"/>
+            <wp:effectExtent l="19050" t="19050" r="19050" b="22860"/>
+            <wp:docPr id="2003105281" name="Picture 1"/>
+            <wp:cNvGraphicFramePr>
+              <a:graphicFrameLocks xmlns:a="http://schemas.openxmlformats.org/drawingml/2006/main" noChangeAspect="1"/>
+            </wp:cNvGraphicFramePr>
+            <a:graphic xmlns:a="http://schemas.openxmlformats.org/drawingml/2006/main">
+              <a:graphicData uri="http://schemas.openxmlformats.org/drawingml/2006/picture">
+                <pic:pic xmlns:pic="http://schemas.openxmlformats.org/drawingml/2006/picture">
+                  <pic:nvPicPr>
+                    <pic:cNvPr id="2003105281" name=""/>
+                    <pic:cNvPicPr/>
+                  </pic:nvPicPr>
+                  <pic:blipFill>
+                    <a:blip r:embed="rId10"/>
+                    <a:stretch>
+                      <a:fillRect/>
+                    </a:stretch>
+                  </pic:blipFill>
+                  <pic:spPr>
+                    <a:xfrm>
+                      <a:off x="0" y="0"/>
+                      <a:ext cx="5943600" cy="3006090"/>
+                    </a:xfrm>
+                    <a:prstGeom prst="rect">
+                      <a:avLst/>
+                    </a:prstGeom>
+                    <a:ln>
+                      <a:solidFill>
+                        <a:schemeClr val="accent1"/>
+                      </a:solidFill>
+                    </a:ln>
+                  </pic:spPr>
+                </pic:pic>
+              </a:graphicData>
+            </a:graphic>
+          </wp:inline>
+        </w:drawing>
+      </w:r>
+    </w:p>
+    <w:p>
+      <w:pPr>
+        <w:pStyle w:val="ListParagraph"/>
+        <w:numPr>
+          <w:ilvl w:val="0"/>
+          <w:numId w:val="4"/>
+        </w:numPr>
+      </w:pPr>
+      <w:r>
         <w:t>VIVADO Address Editor</w:t>
       </w:r>
     </w:p>
@@ -134,6 +324,9 @@
         <w:pStyle w:val="ListParagraph"/>
       </w:pPr>
       <w:r>
+        <w:rPr>
+          <w:noProof/>
+        </w:rPr>
         <w:lastRenderedPageBreak/>
         <w:drawing>
           <wp:inline distT="0" distB="0" distL="0" distR="0" wp14:anchorId="2F557600" wp14:editId="7A560AD1">
@@ -151,7 +344,7 @@
                     <pic:cNvPicPr/>
                   </pic:nvPicPr>
                   <pic:blipFill>
-                    <a:blip r:embed="rId8"/>
+                    <a:blip r:embed="rId11"/>
                     <a:stretch>
                       <a:fillRect/>
                     </a:stretch>
@@ -194,6 +387,9 @@
         <w:ind w:left="720"/>
       </w:pPr>
       <w:r>
+        <w:rPr>
+          <w:noProof/>
+        </w:rPr>
         <w:lastRenderedPageBreak/>
         <w:drawing>
           <wp:inline distT="0" distB="0" distL="0" distR="0" wp14:anchorId="44183B84" wp14:editId="63AA3E86">
@@ -211,7 +407,7 @@
                     <pic:cNvPicPr/>
                   </pic:nvPicPr>
                   <pic:blipFill rotWithShape="1">
-                    <a:blip r:embed="rId9"/>
+                    <a:blip r:embed="rId12"/>
                     <a:srcRect l="1121"/>
                     <a:stretch>
                       <a:fillRect/>
@@ -245,6 +441,9 @@
         </w:drawing>
       </w:r>
       <w:r>
+        <w:rPr>
+          <w:noProof/>
+        </w:rPr>
         <w:drawing>
           <wp:inline distT="0" distB="0" distL="0" distR="0" wp14:anchorId="41DE23FA" wp14:editId="17E54BD8">
             <wp:extent cx="3737024" cy="3333750"/>
@@ -261,7 +460,7 @@
                     <pic:cNvPicPr/>
                   </pic:nvPicPr>
                   <pic:blipFill rotWithShape="1">
-                    <a:blip r:embed="rId10"/>
+                    <a:blip r:embed="rId13"/>
                     <a:srcRect r="15927"/>
                     <a:stretch>
                       <a:fillRect/>
@@ -356,8 +555,126 @@
           <w:sz w:val="22"/>
           <w:szCs w:val="22"/>
         </w:rPr>
-        <w:t>eval sdtgen set_dt_param -dir zephyr -xsa zephyr_wrapper.xsa ; sdtgen generate_sdt</w:t>
-      </w:r>
+        <w:t xml:space="preserve">eval </w:t>
+      </w:r>
+      <w:proofErr w:type="spellStart"/>
+      <w:r>
+        <w:rPr>
+          <w:rFonts w:ascii="Courier New" w:hAnsi="Courier New" w:cs="Courier New"/>
+          <w:sz w:val="22"/>
+          <w:szCs w:val="22"/>
+        </w:rPr>
+        <w:t>sdtgen</w:t>
+      </w:r>
+      <w:proofErr w:type="spellEnd"/>
+      <w:r>
+        <w:rPr>
+          <w:rFonts w:ascii="Courier New" w:hAnsi="Courier New" w:cs="Courier New"/>
+          <w:sz w:val="22"/>
+          <w:szCs w:val="22"/>
+        </w:rPr>
+        <w:t xml:space="preserve"> </w:t>
+      </w:r>
+      <w:proofErr w:type="spellStart"/>
+      <w:r>
+        <w:rPr>
+          <w:rFonts w:ascii="Courier New" w:hAnsi="Courier New" w:cs="Courier New"/>
+          <w:sz w:val="22"/>
+          <w:szCs w:val="22"/>
+        </w:rPr>
+        <w:t>set_dt_param</w:t>
+      </w:r>
+      <w:proofErr w:type="spellEnd"/>
+      <w:r>
+        <w:rPr>
+          <w:rFonts w:ascii="Courier New" w:hAnsi="Courier New" w:cs="Courier New"/>
+          <w:sz w:val="22"/>
+          <w:szCs w:val="22"/>
+        </w:rPr>
+        <w:t xml:space="preserve"> -</w:t>
+      </w:r>
+      <w:proofErr w:type="spellStart"/>
+      <w:r>
+        <w:rPr>
+          <w:rFonts w:ascii="Courier New" w:hAnsi="Courier New" w:cs="Courier New"/>
+          <w:sz w:val="22"/>
+          <w:szCs w:val="22"/>
+        </w:rPr>
+        <w:t>dir</w:t>
+      </w:r>
+      <w:proofErr w:type="spellEnd"/>
+      <w:r>
+        <w:rPr>
+          <w:rFonts w:ascii="Courier New" w:hAnsi="Courier New" w:cs="Courier New"/>
+          <w:sz w:val="22"/>
+          <w:szCs w:val="22"/>
+        </w:rPr>
+        <w:t xml:space="preserve"> zephyr -</w:t>
+      </w:r>
+      <w:proofErr w:type="spellStart"/>
+      <w:r>
+        <w:rPr>
+          <w:rFonts w:ascii="Courier New" w:hAnsi="Courier New" w:cs="Courier New"/>
+          <w:sz w:val="22"/>
+          <w:szCs w:val="22"/>
+        </w:rPr>
+        <w:t>xsa</w:t>
+      </w:r>
+      <w:proofErr w:type="spellEnd"/>
+      <w:r>
+        <w:rPr>
+          <w:rFonts w:ascii="Courier New" w:hAnsi="Courier New" w:cs="Courier New"/>
+          <w:sz w:val="22"/>
+          <w:szCs w:val="22"/>
+        </w:rPr>
+        <w:t xml:space="preserve"> </w:t>
+      </w:r>
+      <w:proofErr w:type="spellStart"/>
+      <w:r>
+        <w:rPr>
+          <w:rFonts w:ascii="Courier New" w:hAnsi="Courier New" w:cs="Courier New"/>
+          <w:sz w:val="22"/>
+          <w:szCs w:val="22"/>
+        </w:rPr>
+        <w:t>zephyr_wrapper.xsa</w:t>
+      </w:r>
+      <w:proofErr w:type="spellEnd"/>
+      <w:r>
+        <w:rPr>
+          <w:rFonts w:ascii="Courier New" w:hAnsi="Courier New" w:cs="Courier New"/>
+          <w:sz w:val="22"/>
+          <w:szCs w:val="22"/>
+        </w:rPr>
+        <w:t xml:space="preserve"> ; </w:t>
+      </w:r>
+      <w:proofErr w:type="spellStart"/>
+      <w:r>
+        <w:rPr>
+          <w:rFonts w:ascii="Courier New" w:hAnsi="Courier New" w:cs="Courier New"/>
+          <w:sz w:val="22"/>
+          <w:szCs w:val="22"/>
+        </w:rPr>
+        <w:t>sdtgen</w:t>
+      </w:r>
+      <w:proofErr w:type="spellEnd"/>
+      <w:r>
+        <w:rPr>
+          <w:rFonts w:ascii="Courier New" w:hAnsi="Courier New" w:cs="Courier New"/>
+          <w:sz w:val="22"/>
+          <w:szCs w:val="22"/>
+        </w:rPr>
+        <w:t xml:space="preserve"> </w:t>
+      </w:r>
+      <w:proofErr w:type="spellStart"/>
+      <w:r>
+        <w:rPr>
+          <w:rFonts w:ascii="Courier New" w:hAnsi="Courier New" w:cs="Courier New"/>
+          <w:sz w:val="22"/>
+          <w:szCs w:val="22"/>
+        </w:rPr>
+        <w:t>generate_sdt</w:t>
+      </w:r>
+      <w:proofErr w:type="spellEnd"/>
     </w:p>
     <w:p>
       <w:pPr>
@@ -377,6 +694,9 @@
         <w:jc w:val="center"/>
       </w:pPr>
       <w:r>
+        <w:rPr>
+          <w:noProof/>
+        </w:rPr>
         <w:drawing>
           <wp:inline distT="0" distB="0" distL="0" distR="0" wp14:anchorId="4962DC54" wp14:editId="13CC416C">
             <wp:extent cx="5943600" cy="2315845"/>
@@ -393,7 +713,7 @@
                     <pic:cNvPicPr/>
                   </pic:nvPicPr>
                   <pic:blipFill>
-                    <a:blip r:embed="rId11"/>
+                    <a:blip r:embed="rId14"/>
                     <a:stretch>
                       <a:fillRect/>
                     </a:stretch>
@@ -541,8 +861,8 @@
     <w:p/>
     <w:p/>
     <w:sectPr>
-      <w:headerReference w:type="default" r:id="rId12"/>
-      <w:footerReference w:type="default" r:id="rId13"/>
+      <w:headerReference w:type="default" r:id="rId15"/>
+      <w:footerReference w:type="default" r:id="rId16"/>
       <w:pgSz w:w="12240" w:h="15840"/>
       <w:pgMar w:top="1440" w:right="1440" w:bottom="1440" w:left="1440" w:header="720" w:footer="720" w:gutter="0"/>
       <w:cols w:space="720"/>

</xml_diff>